<commit_message>
Auto commit (2026-09-23 18:08) — 9 changes
Claude Code 세션 종료 시 자동 커밋.

Co-Authored-By: Claude <noreply@anthropic.com>
Claude-Session: https://claude.ai/code/0b9c28ed-17d6-46a9-b519-059f3d6e0a51
</commit_message>
<xml_diff>
--- a/projects/34_storm_dragon_bride/I Bought the Dragon Lord for One Night_작품개요.docx
+++ b/projects/34_storm_dragon_bride/I Bought the Dragon Lord for One Night_작품개요.docx
@@ -504,7 +504,29 @@
         <w:rPr>
           <w:b w:val="0"/>
         </w:rPr>
+        <w:t>원작은 야한 장면 말고는 사람을 끌어오는 장면이 약했다. 그래서 인물관계, 모욕, 배신, 굴욕, 사이다 장면을 더 세고 눈에 보이게 고쳤다. 예를 들어 1화에서 약혼자 가릭이 비비안 곁으로 건너가 서고, 14화에서 비비안이 오필리아 발밑에 내던져지고, 38화에서 국왕이 광장 앞에서 무릎을 꿇는다.</w:t>
+      </w:r>
+    </w:p>
+    <w:p>
+      <w:pPr>
+        <w:pStyle w:val="ListBullet2"/>
+      </w:pPr>
+      <w:r>
+        <w:rPr>
+          <w:b w:val="0"/>
+        </w:rPr>
         <w:t>베드신은 오필리아의 반응이 보이게 열기를 보강했고, 오필리아의 감정선도 보강했다.</w:t>
+      </w:r>
+    </w:p>
+    <w:p>
+      <w:pPr>
+        <w:pStyle w:val="ListBullet2"/>
+      </w:pPr>
+      <w:r>
+        <w:rPr>
+          <w:b w:val="0"/>
+        </w:rPr>
+        <w:t>되풀이되는 반응이나 분위기만 까는 지문을 덜어 분량을 원작보다 줄였다.</w:t>
       </w:r>
     </w:p>
     <w:p>
@@ -687,7 +709,7 @@
         <w:rPr>
           <w:b w:val="0"/>
         </w:rPr>
-        <w:t xml:space="preserve"> — 원작 완성본은 67분 42초다. 우리 대본은 대사 양과 동작 수가 원작과 거의 같아서, 원작처럼 타이트하게 찍으면 약 68분이 나온다. 상한은 70분이다.</w:t>
+        <w:t xml:space="preserve"> — 원작 완성본은 67분 42초다. 우리 대본은 원작보다 지문 동작이 약 90개, 영어 대사가 약 190단어 적어서, 원작과 같은 템포로 찍으면 약 64분이 나온다. 상한은 70분이다.</w:t>
       </w:r>
     </w:p>
     <w:p>
@@ -1197,7 +1219,29 @@
         <w:rPr>
           <w:b w:val="0"/>
         </w:rPr>
+        <w:t>原作除了床戏之外，能吸引观众的场面较弱。因此我们把人物关系、羞辱、背叛、屈辱、爽点场面改得更狠、更直观。例如第1集未婚夫加里克走到薇薇安身边站定，第14集薇薇安被甩在奥菲莉娅脚下，第38集国王当着全广场的面跪倒。</w:t>
+      </w:r>
+    </w:p>
+    <w:p>
+      <w:pPr>
+        <w:pStyle w:val="ListBullet2"/>
+      </w:pPr>
+      <w:r>
+        <w:rPr>
+          <w:b w:val="0"/>
+        </w:rPr>
         <w:t>床戏加强了奥菲莉娅的反应与热度，也加强了她的情感线。</w:t>
+      </w:r>
+    </w:p>
+    <w:p>
+      <w:pPr>
+        <w:pStyle w:val="ListBullet2"/>
+      </w:pPr>
+      <w:r>
+        <w:rPr>
+          <w:b w:val="0"/>
+        </w:rPr>
+        <w:t>删减了重复反应和只铺氛围的场景描述，篇幅比原作更短。</w:t>
       </w:r>
     </w:p>
     <w:p>
@@ -1380,7 +1424,7 @@
         <w:rPr>
           <w:b w:val="0"/>
         </w:rPr>
-        <w:t xml:space="preserve"> — 原作成片为67分42秒。本剧台词量和动作数与原作几乎相同，按原作同样紧凑的节奏拍摄约68分钟。上限为70分钟。</w:t>
+        <w:t xml:space="preserve"> — 原作成片为67分42秒。本剧比原作少约90个动作、约190个英语台词单词，按原作同样的节奏拍摄约64分钟。上限为70分钟。</w:t>
       </w:r>
     </w:p>
     <w:sectPr>

</xml_diff>